<commit_message>
Teaching Your Lesson: keep the raw version of everything
Field notes as written, redacted copies of student work, photos of the
board: the Final Report appendix needs the raw version of every piece.

Co-Authored-By: Claude Opus 5.5 <noreply@anthropic.com>
</commit_message>
<xml_diff>
--- a/week-10-investigation-plan/teaching-your-lesson.docx
+++ b/week-10-investigation-plan/teaching-your-lesson.docx
@@ -99,6 +99,29 @@
       <w:r>
         <w:rPr/>
         <w:t>Collect evidence that speaks to your question: your students' work, photos of what they did, notes on what they said. Gather more than you think you will need.</w:t>
+      </w:r>
+    </w:p>
+    <w:p>
+      <w:pPr>
+        <w:pStyle w:val="ListBullet"/>
+        <w:numPr>
+          <w:ilvl w:val="0"/>
+          <w:numId w:val="1"/>
+        </w:numPr>
+        <w:spacing w:lineRule="auto" w:line="240" w:before="0" w:after="0"/>
+        <w:contextualSpacing/>
+        <w:rPr/>
+      </w:pPr>
+      <w:r>
+        <w:rPr>
+          <w:b/>
+          <w:bCs/>
+        </w:rPr>
+        <w:t xml:space="preserve">Keep the raw version of everything. </w:t>
+      </w:r>
+      <w:r>
+        <w:rPr/>
+        <w:t xml:space="preserve">Your field notes as you wrote them: the index card, the notebook page, the screenshot from your phone. A copy of each student’s work, with names redacted, before it goes back. A photo of board work before it’s erased. Every piece of evidence you write about in your Final Report needs its raw version in the appendix.</w:t>
       </w:r>
     </w:p>
     <w:p>

</xml_diff>